<commit_message>
Letter of support: use invoice-builder letterhead and company email
Co-Authored-By: Claude Opus 5.5 <noreply@anthropic.com>
Claude-Session: https://claude.ai/code/session_01Eb5aT75uoYfQthS795CfJS
</commit_message>
<xml_diff>
--- a/letters/Letter_of_Support_Sabrina_DAYS_letterhead.docx
+++ b/letters/Letter_of_Support_Sabrina_DAYS_letterhead.docx
@@ -401,7 +401,7 @@
       <w:footerReference w:type="default" r:id="rIdF1"/>
       <w:footerReference w:type="first" r:id="rIdF1"/>
       <w:pgSz w:h="16834" w:w="11909" w:orient="portrait"/>
-      <w:pgMar w:bottom="1440" w:top="1440" w:left="1440" w:right="1440" w:header="567" w:footer="567"/>
+      <w:pgMar w:bottom="1440" w:top="1440" w:left="1440" w:right="1440" w:header="660" w:footer="567"/>
       <w:pgNumType w:start="1"/>
       <w:titlePg/>
     </w:sectPr>
@@ -413,20 +413,19 @@
 <w:ftr xmlns:w="http://schemas.openxmlformats.org/wordprocessingml/2006/main" xmlns:r="http://schemas.openxmlformats.org/officeDocument/2006/relationships" xmlns:wp="http://schemas.openxmlformats.org/drawingml/2006/wordprocessingDrawing" xmlns:a="http://schemas.openxmlformats.org/drawingml/2006/main" xmlns:pic="http://schemas.openxmlformats.org/drawingml/2006/picture">
   <w:p>
     <w:pPr>
-      <w:pBdr>
-        <w:top w:val="single" w:sz="4" w:space="6" w:color="E8E0D8"/>
-      </w:pBdr>
       <w:spacing w:before="0" w:after="0" w:line="240" w:lineRule="auto"/>
       <w:jc w:val="center"/>
     </w:pPr>
     <w:r>
       <w:rPr>
         <w:rFonts w:ascii="Arial" w:hAnsi="Arial" w:cs="Arial"/>
-        <w:color w:val="6E655E"/>
+        <w:caps/>
+        <w:color w:val="5B5A86"/>
+        <w:spacing w:val="10"/>
         <w:sz w:val="14"/>
         <w:szCs w:val="14"/>
       </w:rPr>
-      <w:t xml:space="preserve">PT Vakansi Media Global  ·  NIB 2606240050689  ·  NPWP 0200 7162 0701 5000</w:t>
+      <w:t xml:space="preserve">PT. Vakansi Media Global  ·  NIB 2606240050689  ·  NPWP 0200 7162 0701 5000</w:t>
     </w:r>
   </w:p>
 </w:ftr>
@@ -452,33 +451,25 @@
       </w:tblCellMar>
     </w:tblPr>
     <w:tblGrid>
-      <w:gridCol w:w="4000"/>
-      <w:gridCol w:w="5029"/>
+      <w:gridCol w:w="4800"/>
+      <w:gridCol w:w="4229"/>
     </w:tblGrid>
     <w:tr>
       <w:tc>
         <w:tcPr>
-          <w:tcW w:w="4000" w:type="dxa"/>
-          <w:tcBorders>
-            <w:bottom w:val="single" w:sz="12" w:space="0" w:color="EC5B39"/>
-          </w:tcBorders>
-          <w:tcMar>
-            <w:left w:w="0" w:type="dxa"/>
-            <w:bottom w:w="160" w:type="dxa"/>
-            <w:right w:w="0" w:type="dxa"/>
-          </w:tcMar>
-          <w:vAlign w:val="bottom"/>
+          <w:tcW w:w="4800" w:type="dxa"/>
+          <w:vAlign w:val="top"/>
         </w:tcPr>
         <w:p>
           <w:pPr>
-            <w:spacing w:before="0" w:after="0" w:line="240" w:lineRule="auto"/>
+            <w:spacing w:before="0" w:after="150" w:line="240" w:lineRule="auto"/>
             <w:jc w:val="left"/>
           </w:pPr>
           <w:r>
             <w:drawing>
               <wp:inline distT="0" distB="0" distL="0" distR="0">
-                <wp:extent cx="1463040" cy="417122"/>
-                <wp:docPr id="101" name="DAYS wordmark" descr="DAYS"/>
+                <wp:extent cx="1135460" cy="323727"/>
+                <wp:docPr id="101" name="DAYS" descr="DAYS"/>
                 <wp:cNvGraphicFramePr>
                   <a:graphicFrameLocks noChangeAspect="1"/>
                 </wp:cNvGraphicFramePr>
@@ -498,7 +489,7 @@
                       <pic:spPr>
                         <a:xfrm>
                           <a:off x="0" y="0"/>
-                          <a:ext cx="1463040" cy="417122"/>
+                          <a:ext cx="1135460" cy="323727"/>
                         </a:xfrm>
                         <a:prstGeom prst="rect">
                           <a:avLst/>
@@ -511,88 +502,136 @@
             </w:drawing>
           </w:r>
         </w:p>
+        <w:p>
+          <w:pPr>
+            <w:spacing w:before="0" w:after="30" w:line="240" w:lineRule="auto"/>
+            <w:jc w:val="left"/>
+          </w:pPr>
+          <w:r>
+            <w:rPr>
+              <w:rFonts w:ascii="Arial" w:hAnsi="Arial" w:cs="Arial"/>
+              <w:b/>
+              <w:color w:val="2E2D6B"/>
+              <w:sz w:val="19"/>
+              <w:szCs w:val="19"/>
+            </w:rPr>
+            <w:t xml:space="preserve">PT. Vakansi Media Global</w:t>
+          </w:r>
+        </w:p>
+        <w:p>
+          <w:pPr>
+            <w:spacing w:before="0" w:after="30" w:line="240" w:lineRule="auto"/>
+            <w:jc w:val="left"/>
+          </w:pPr>
+          <w:r>
+            <w:rPr>
+              <w:rFonts w:ascii="Arial" w:hAnsi="Arial" w:cs="Arial"/>
+              <w:color w:val="5B5A86"/>
+              <w:sz w:val="19"/>
+              <w:szCs w:val="19"/>
+            </w:rPr>
+            <w:t xml:space="preserve">Jalan Tebet Barat IX No. 2</w:t>
+          </w:r>
+        </w:p>
+        <w:p>
+          <w:pPr>
+            <w:spacing w:before="0" w:after="30" w:line="240" w:lineRule="auto"/>
+            <w:jc w:val="left"/>
+          </w:pPr>
+          <w:r>
+            <w:rPr>
+              <w:rFonts w:ascii="Arial" w:hAnsi="Arial" w:cs="Arial"/>
+              <w:color w:val="5B5A86"/>
+              <w:sz w:val="19"/>
+              <w:szCs w:val="19"/>
+            </w:rPr>
+            <w:t xml:space="preserve">Jakarta Selatan 12810</w:t>
+          </w:r>
+        </w:p>
+        <w:p>
+          <w:pPr>
+            <w:spacing w:before="0" w:after="0" w:line="240" w:lineRule="auto"/>
+            <w:jc w:val="left"/>
+          </w:pPr>
+          <w:r>
+            <w:rPr>
+              <w:rFonts w:ascii="Arial" w:hAnsi="Arial" w:cs="Arial"/>
+              <w:color w:val="5B5A86"/>
+              <w:sz w:val="19"/>
+              <w:szCs w:val="19"/>
+            </w:rPr>
+            <w:t xml:space="preserve">+62-812-20000-185</w:t>
+          </w:r>
+        </w:p>
       </w:tc>
       <w:tc>
         <w:tcPr>
-          <w:tcW w:w="5029" w:type="dxa"/>
-          <w:tcBorders>
-            <w:bottom w:val="single" w:sz="12" w:space="0" w:color="EC5B39"/>
-          </w:tcBorders>
-          <w:tcMar>
-            <w:left w:w="0" w:type="dxa"/>
-            <w:bottom w:w="160" w:type="dxa"/>
-            <w:right w:w="0" w:type="dxa"/>
-          </w:tcMar>
-          <w:vAlign w:val="bottom"/>
+          <w:tcW w:w="4229" w:type="dxa"/>
+          <w:vAlign w:val="top"/>
         </w:tcPr>
         <w:p>
           <w:pPr>
-            <w:spacing w:before="0" w:after="20" w:line="240" w:lineRule="auto"/>
+            <w:spacing w:before="0" w:after="150" w:line="240" w:lineRule="auto"/>
             <w:jc w:val="right"/>
           </w:pPr>
           <w:r>
             <w:rPr>
               <w:rFonts w:ascii="Arial" w:hAnsi="Arial" w:cs="Arial"/>
               <w:b/>
-              <w:color w:val="1B1714"/>
-              <w:sz w:val="17"/>
-              <w:szCs w:val="17"/>
+              <w:caps/>
+              <w:color w:val="2E2D6B"/>
+              <w:sz w:val="30"/>
+              <w:szCs w:val="30"/>
             </w:rPr>
-            <w:t xml:space="preserve">PT Vakansi Media Global</w:t>
+            <w:t xml:space="preserve">Letter of Support</w:t>
           </w:r>
         </w:p>
         <w:p>
           <w:pPr>
-            <w:spacing w:before="0" w:after="20" w:line="240" w:lineRule="auto"/>
+            <w:spacing w:before="0" w:after="30" w:line="240" w:lineRule="auto"/>
             <w:jc w:val="right"/>
           </w:pPr>
           <w:r>
             <w:rPr>
               <w:rFonts w:ascii="Arial" w:hAnsi="Arial" w:cs="Arial"/>
-              <w:color w:val="6E655E"/>
-              <w:sz w:val="16"/>
-              <w:szCs w:val="16"/>
+              <w:color w:val="5B5A86"/>
+              <w:sz w:val="19"/>
+              <w:szCs w:val="19"/>
             </w:rPr>
-            <w:t xml:space="preserve">Jl. Tebet Barat IX No. 2, Tebet</w:t>
+            <w:t xml:space="preserve">Email:  </w:t>
+          </w:r>
+          <w:r>
+            <w:rPr>
+              <w:rFonts w:ascii="Courier New" w:hAnsi="Courier New" w:cs="Courier New"/>
+              <w:color w:val="2E2D6B"/>
+              <w:sz w:val="18"/>
+              <w:szCs w:val="18"/>
+            </w:rPr>
+            <w:t xml:space="preserve">lets@talkaboutdays.com</w:t>
           </w:r>
         </w:p>
         <w:p>
           <w:pPr>
-            <w:spacing w:before="0" w:after="20" w:line="240" w:lineRule="auto"/>
+            <w:spacing w:before="0" w:after="30" w:line="240" w:lineRule="auto"/>
             <w:jc w:val="right"/>
           </w:pPr>
           <w:r>
             <w:rPr>
               <w:rFonts w:ascii="Arial" w:hAnsi="Arial" w:cs="Arial"/>
-              <w:color w:val="6E655E"/>
-              <w:sz w:val="16"/>
-              <w:szCs w:val="16"/>
+              <w:color w:val="5B5A86"/>
+              <w:sz w:val="19"/>
+              <w:szCs w:val="19"/>
             </w:rPr>
-            <w:t xml:space="preserve">South Jakarta 12810, Indonesia</w:t>
-          </w:r>
-        </w:p>
-        <w:p>
-          <w:pPr>
-            <w:spacing w:before="0" w:after="0" w:line="240" w:lineRule="auto"/>
-            <w:jc w:val="right"/>
-          </w:pPr>
-          <w:r>
-            <w:rPr>
-              <w:rFonts w:ascii="Arial" w:hAnsi="Arial" w:cs="Arial"/>
-              <w:color w:val="C9431F"/>
-              <w:sz w:val="16"/>
-              <w:szCs w:val="16"/>
-            </w:rPr>
-            <w:t xml:space="preserve">talkaboutdays.com</w:t>
+            <w:t xml:space="preserve">Web:  </w:t>
           </w:r>
           <w:r>
             <w:rPr>
-              <w:rFonts w:ascii="Arial" w:hAnsi="Arial" w:cs="Arial"/>
-              <w:color w:val="6E655E"/>
-              <w:sz w:val="16"/>
-              <w:szCs w:val="16"/>
+              <w:rFonts w:ascii="Courier New" w:hAnsi="Courier New" w:cs="Courier New"/>
+              <w:color w:val="2E2D6B"/>
+              <w:sz w:val="18"/>
+              <w:szCs w:val="18"/>
             </w:rPr>
-            <w:t xml:space="preserve">  ·  +62 812-2000-0185</w:t>
+            <w:t xml:space="preserve">talkaboutdays.com</w:t>
           </w:r>
         </w:p>
       </w:tc>
@@ -600,6 +639,9 @@
   </w:tbl>
   <w:p>
     <w:pPr>
+      <w:pBdr>
+        <w:bottom w:val="single" w:sz="24" w:space="1" w:color="E65F38"/>
+      </w:pBdr>
       <w:spacing w:before="0" w:after="0" w:line="240" w:lineRule="auto"/>
       <w:jc w:val="left"/>
     </w:pPr>
@@ -612,13 +654,13 @@
   <w:p>
     <w:pPr>
       <w:spacing w:before="0" w:after="0" w:line="240" w:lineRule="auto"/>
-      <w:jc w:val="right"/>
+      <w:jc w:val="left"/>
     </w:pPr>
     <w:r>
       <w:drawing>
         <wp:inline distT="0" distB="0" distL="0" distR="0">
-          <wp:extent cx="822960" cy="234631"/>
-          <wp:docPr id="102" name="DAYS wordmark" descr="DAYS"/>
+          <wp:extent cx="851594" cy="242795"/>
+          <wp:docPr id="102" name="DAYS" descr="DAYS"/>
           <wp:cNvGraphicFramePr>
             <a:graphicFrameLocks noChangeAspect="1"/>
           </wp:cNvGraphicFramePr>
@@ -638,7 +680,7 @@
                 <pic:spPr>
                   <a:xfrm>
                     <a:off x="0" y="0"/>
-                    <a:ext cx="822960" cy="234631"/>
+                    <a:ext cx="851594" cy="242795"/>
                   </a:xfrm>
                   <a:prstGeom prst="rect">
                     <a:avLst/>

</xml_diff>